<commit_message>
2.3 bol push through
</commit_message>
<xml_diff>
--- a/12_RMarkdown.docx
+++ b/12_RMarkdown.docx
@@ -473,10 +473,10 @@
         <w:t xml:space="preserve"> </w:t>
       </w:r>
       <w:r>
-        <w:t xml:space="preserve">A PDF file is created because YAML header says output pdf_document</w:t>
-      </w:r>
-      <w:r>
-        <w:t xml:space="preserve"> </w:t>
+        <w:t xml:space="preserve">A PDF file is created because YAML header says output 12_MRmarkdwon.docx</w:t>
+      </w:r>
+      <w:r>
+        <w:br/>
       </w:r>
       <w:r>
         <w:t xml:space="preserve">…………………….</w:t>
@@ -506,6 +506,12 @@
       </w:r>
       <w:r>
         <w:t xml:space="preserve">ANSWER:</w:t>
+      </w:r>
+      <w:r>
+        <w:t xml:space="preserve"> </w:t>
+      </w:r>
+      <w:r>
+        <w:t xml:space="preserve">the Rmd file is editable source file that contains the YAML header,written text, and R code chunks.The PDF is the finsh output</w:t>
       </w:r>
     </w:p>
     <w:p>
@@ -647,7 +653,7 @@
         <w:br/>
       </w:r>
       <w:r>
-        <w:t xml:space="preserve">ANSWER:</w:t>
+        <w:t xml:space="preserve">ANSWER:the line starts with section 2:formatting a Report using RMarkdwon syntanx becomes a large heading/title in the knitted document.</w:t>
       </w:r>
     </w:p>
     <w:p>
@@ -755,7 +761,7 @@
         <w:br/>
       </w:r>
       <w:r>
-        <w:t xml:space="preserve">ANSWER:</w:t>
+        <w:t xml:space="preserve">ANSWER:As you increase the number of hashtags,the heading gets smaller.</w:t>
       </w:r>
     </w:p>
     <w:p>
@@ -785,7 +791,7 @@
         <w:br/>
       </w:r>
       <w:r>
-        <w:t xml:space="preserve">ANSWER:</w:t>
+        <w:t xml:space="preserve">ANSWER:You would use one hashtag for the highest level heading and largest font</w:t>
       </w:r>
     </w:p>
     <w:p>
@@ -807,7 +813,7 @@
         <w:br/>
       </w:r>
       <w:r>
-        <w:t xml:space="preserve">ANSWER:</w:t>
+        <w:t xml:space="preserve">ANSWER:no line 5 and 6 should appear on separate lines because each one is written as its own heading with hashtags</w:t>
       </w:r>
     </w:p>
     <w:p>
@@ -864,7 +870,7 @@
         <w:br/>
       </w:r>
       <w:r>
-        <w:t xml:space="preserve">ANSWER:</w:t>
+        <w:t xml:space="preserve">ANSWER:yes line 5 and 6 appereared on different lines in the html output.</w:t>
       </w:r>
     </w:p>
     <w:p>
@@ -1118,11 +1124,25 @@
       <w:r>
         <w:t xml:space="preserve">ANSWER:</w:t>
       </w:r>
-    </w:p>
-    <w:p>
-      <w:pPr>
-        <w:pStyle w:val="BodyText"/>
-      </w:pPr>
+      <w:r>
+        <w:t xml:space="preserve"> </w:t>
+      </w:r>
+      <w:r>
+        <w:t xml:space="preserve">Line 1: This is an example to show how to make text</w:t>
+      </w:r>
+      <w:r>
+        <w:t xml:space="preserve"> </w:t>
+      </w:r>
+      <w:r>
+        <w:rPr>
+          <w:i/>
+          <w:iCs/>
+        </w:rPr>
+        <w:t xml:space="preserve">italics.</w:t>
+      </w:r>
+      <w:r>
+        <w:br/>
+      </w:r>
       <w:r>
         <w:br/>
       </w:r>
@@ -1212,7 +1232,55 @@
         <w:pStyle w:val="BodyText"/>
       </w:pPr>
       <w:r>
-        <w:br/>
+        <w:t xml:space="preserve">name is</w:t>
+      </w:r>
+      <w:r>
+        <w:t xml:space="preserve"> </w:t>
+      </w:r>
+      <w:r>
+        <w:rPr>
+          <w:i/>
+          <w:iCs/>
+        </w:rPr>
+        <w:t xml:space="preserve">Arnav</w:t>
+      </w:r>
+      <w:r>
+        <w:t xml:space="preserve"> </w:t>
+      </w:r>
+      <w:r>
+        <w:t xml:space="preserve">Pandey. I am currently enrolled in</w:t>
+      </w:r>
+      <w:r>
+        <w:t xml:space="preserve"> </w:t>
+      </w:r>
+      <w:r>
+        <w:rPr>
+          <w:i/>
+          <w:iCs/>
+        </w:rPr>
+        <w:t xml:space="preserve">Biological Data Wrangling and Visualization</w:t>
+      </w:r>
+      <w:r>
+        <w:t xml:space="preserve"> </w:t>
+      </w:r>
+      <w:r>
+        <w:t xml:space="preserve">(BIO 457/657). This is a TASK: to use</w:t>
+      </w:r>
+      <w:r>
+        <w:t xml:space="preserve"> </w:t>
+      </w:r>
+      <w:r>
+        <w:rPr>
+          <w:i/>
+          <w:iCs/>
+        </w:rPr>
+        <w:t xml:space="preserve">RMarkdown</w:t>
+      </w:r>
+      <w:r>
+        <w:t xml:space="preserve"> </w:t>
+      </w:r>
+      <w:r>
+        <w:t xml:space="preserve">to make a text output italics.</w:t>
       </w:r>
     </w:p>
     <w:p>

</xml_diff>